<commit_message>
Remove Journal Format meta-section from AI Working Journal doc
Steps go straight into content — no explanatory header about the format.

https://claude.ai/code/session_01Hkwcu3FSd98RxpbTCWraEL
</commit_message>
<xml_diff>
--- a/docs/AI_Working_Journal_HCLTech.docx
+++ b/docs/AI_Working_Journal_HCLTech.docx
@@ -14,7 +14,7 @@
       <w:tr>
         <w:tc>
           <w:tcPr>
-            <w:tcW w:type="dxa" w:w="9360"/>
+            <w:tcW w:type="dxa" w:w="9746"/>
             <w:shd w:val="clear" w:color="auto" w:fill="0D1B4B"/>
           </w:tcPr>
           <w:p>
@@ -629,7 +629,7 @@
           <w:color w:val="222222"/>
           <w:sz w:val="21"/>
         </w:rPr>
-        <w:t>001_bronze_tables.sql (559 lines) — Serverless SQL external tables on ADLS Gen2 with Managed Identity credential, Delta + Parquet formats, partitioned by ingestion_date</w:t>
+        <w:t>001_bronze_tables.sql (559 lines) — Serverless SQL external tables on ADLS Gen2, Managed Identity, Delta + Parquet formats, partitioned by ingestion_date</w:t>
       </w:r>
     </w:p>
     <w:p>
@@ -643,7 +643,7 @@
           <w:color w:val="222222"/>
           <w:sz w:val="21"/>
         </w:rPr>
-        <w:t>002_silver_dimensions.sql (467 lines) — 8 conformed dims: SCD2 with scd_hash SHA2_256, CCI, REPLICATE distribution on small dims</w:t>
+        <w:t>002_silver_dimensions.sql (467 lines) — 8 conformed dims with SCD2, scd_hash SHA2_256, CCI, REPLICATE distribution</w:t>
       </w:r>
     </w:p>
     <w:p>
@@ -657,7 +657,7 @@
           <w:color w:val="222222"/>
           <w:sz w:val="21"/>
         </w:rPr>
-        <w:t>003_silver_facts.sql (565 lines) — 6 normalised fact tables, HASH distribution, quarterly RANGE RIGHT partitions, dedup hash column</w:t>
+        <w:t>003_silver_facts.sql (565 lines) — 6 normalised fact tables, HASH distribution, quarterly RANGE RIGHT partitions, dedup hash</w:t>
       </w:r>
     </w:p>
     <w:p>
@@ -671,7 +671,7 @@
           <w:color w:val="222222"/>
           <w:sz w:val="21"/>
         </w:rPr>
-        <w:t>004_gold_dimensions.sql (367 lines) — 6 current-snapshot Gold dims with silver_sk lineage columns, REPLICATE distribution</w:t>
+        <w:t>004_gold_dimensions.sql (367 lines) — 6 current-snapshot Gold dims with silver_sk lineage columns</w:t>
       </w:r>
     </w:p>
     <w:p>
@@ -685,7 +685,7 @@
           <w:color w:val="222222"/>
           <w:sz w:val="21"/>
         </w:rPr>
-        <w:t>005_gold_facts.sql (643 lines) — 3 AI-scored fact tables, 2 pre-aggregates (hourly/daily), anomaly registry, log classifications, embeddings store</w:t>
+        <w:t>005_gold_facts.sql (643 lines) — 3 AI-scored facts, 2 pre-aggregates, anomaly registry, log classifications, embeddings store</w:t>
       </w:r>
     </w:p>
     <w:p>
@@ -699,7 +699,7 @@
           <w:color w:val="222222"/>
           <w:sz w:val="21"/>
         </w:rPr>
-        <w:t>Total: 5 migration scripts, 2,601 lines of valid Azure Synapse SQL</w:t>
+        <w:t>Total: 5 migration scripts — 2,601 lines of valid Azure Synapse SQL</w:t>
       </w:r>
     </w:p>
     <w:p>
@@ -813,7 +813,7 @@
           <w:color w:val="222222"/>
           <w:sz w:val="21"/>
         </w:rPr>
-        <w:t>slv_transform_transactions.ipynb — Incremental Bronze load, 3-gate DQ (null check, dedup on raw_log_id, amount &gt; 0), ISO standardisation, surrogate key broadcast joins, Delta MERGE upsert, DQ metrics to control table</w:t>
+        <w:t>slv_transform_transactions.ipynb — Incremental Bronze load, 3-gate DQ (null/dedup/amount), ISO standardisation, surrogate key broadcast joins, Delta MERGE</w:t>
       </w:r>
     </w:p>
     <w:p>
@@ -827,7 +827,7 @@
           <w:color w:val="222222"/>
           <w:sz w:val="21"/>
         </w:rPr>
-        <w:t>slv_transform_auth.ipynb — JSON payload parsing via from_json, IP-to-country UDF, 1-hour rolling failure velocity window, is_high_velocity flag, Delta MERGE</w:t>
+        <w:t>slv_transform_auth.ipynb — JSON payload parsing, IP-to-country UDF, 1-hour rolling failure velocity window, Delta MERGE to slv_auth_logs</w:t>
       </w:r>
     </w:p>
     <w:p>
@@ -841,7 +841,7 @@
           <w:color w:val="222222"/>
           <w:sz w:val="21"/>
         </w:rPr>
-        <w:t>gld_build_fact_transactions.ipynb — 5-way broadcast star schema join, Z-score anomaly scoring, anomaly_score [0–1], ai_risk_label (NORMAL/SUSPICIOUS/HIGH_RISK)</w:t>
+        <w:t>gld_build_fact_transactions.ipynb — 5-way broadcast star schema join, Z-score anomaly scoring, anomaly_score [0–1], ai_risk_label thresholds</w:t>
       </w:r>
     </w:p>
     <w:p>
@@ -855,7 +855,7 @@
           <w:color w:val="222222"/>
           <w:sz w:val="21"/>
         </w:rPr>
-        <w:t>gld_build_aggregates.ipynb — gld_agg_txn_hourly (P95 via percentile_approx), gld_agg_auth_daily (failure rate, countDistinct IPs), dynamic partition overwrite</w:t>
+        <w:t>gld_build_aggregates.ipynb — gld_agg_txn_hourly (P95 response time), gld_agg_auth_daily (failure rate, countDistinct IPs), dynamic partition overwrite</w:t>
       </w:r>
     </w:p>
     <w:p>
@@ -869,7 +869,7 @@
           <w:color w:val="222222"/>
           <w:sz w:val="21"/>
         </w:rPr>
-        <w:t>Total: 5 notebooks, ~1,200 lines of PySpark, nbformat 4.4 compatible with Azure Synapse</w:t>
+        <w:t>Total: 5 notebooks — ~1,200 lines of PySpark, nbformat 4.4 compatible with Azure Synapse</w:t>
       </w:r>
     </w:p>
     <w:p>
@@ -969,7 +969,7 @@
           <w:color w:val="222222"/>
           <w:sz w:val="21"/>
         </w:rPr>
-        <w:t>pl_bronze_ingest.json (380 lines) — 15-min ScheduleTrigger, Lookup watermark from control table, ExecuteNotebook, stored proc watermark update, error handler pipeline</w:t>
+        <w:t>pl_bronze_ingest.json (380 lines) — 15-min ScheduleTrigger, watermark Lookup, ExecuteNotebook, stored proc update, error handler</w:t>
       </w:r>
     </w:p>
     <w:p>
@@ -983,7 +983,7 @@
           <w:color w:val="222222"/>
           <w:sz w:val="21"/>
         </w:rPr>
-        <w:t>pl_silver_transform.json (280 lines) — Parallel ExecuteNotebook (transactions + auth), fan-in Script zero-row DQ validation, SetVariable row counts</w:t>
+        <w:t>pl_silver_transform.json (280 lines) — Parallel notebooks (transactions + auth), fan-in Script zero-row DQ validation, SetVariable row counts</w:t>
       </w:r>
     </w:p>
     <w:p>
@@ -997,7 +997,7 @@
           <w:color w:val="222222"/>
           <w:sz w:val="21"/>
         </w:rPr>
-        <w:t>pl_gold_build.json (301 lines) — Sequential notebook execution, Script view refresh stored proc, WebActivity Logic App notify on success and failure</w:t>
+        <w:t>pl_gold_build.json (301 lines) — Sequential notebooks, view refresh stored proc, WebActivity Logic App notify on success and failure</w:t>
       </w:r>
     </w:p>
     <w:p>
@@ -1011,7 +1011,7 @@
           <w:color w:val="222222"/>
           <w:sz w:val="21"/>
         </w:rPr>
-        <w:t>pl_master_orchestrator.json (526 lines) — Bronze→Silver→Gold sequence, Until polling loops with 1h/3h/4h stage timeouts, combined status notification</w:t>
+        <w:t>pl_master_orchestrator.json (526 lines) — Bronze→Silver→Gold sequence, Until polling loops with 1h/3h/4h stage timeouts</w:t>
       </w:r>
     </w:p>
     <w:p>
@@ -1025,7 +1025,7 @@
           <w:color w:val="222222"/>
           <w:sz w:val="21"/>
         </w:rPr>
-        <w:t>infra/bicep/main.bicep (449 lines) — Full Azure environment: Synapse, ADLS Gen2 (ZRS, HNS), Event Hubs, Key Vault, Spark Pool, Dedicated SQL Pool, Azure OpenAI, MSI role assignments</w:t>
+        <w:t>infra/bicep/main.bicep (449 lines) — Synapse, ADLS Gen2 (ZRS/HNS), Event Hubs, Key Vault, Spark Pool (autoscale 3–10), Dedicated SQL Pool, Azure OpenAI, MSI role assignments</w:t>
       </w:r>
     </w:p>
     <w:p>
@@ -1125,7 +1125,7 @@
           <w:color w:val="222222"/>
           <w:sz w:val="21"/>
         </w:rPr>
-        <w:t>docs/data_model_er.md (1,755 lines) produced with full data model reference</w:t>
+        <w:t>docs/data_model_er.md (1,755 lines) — full data model reference document</w:t>
       </w:r>
     </w:p>
     <w:p>
@@ -1139,7 +1139,7 @@
           <w:color w:val="222222"/>
           <w:sz w:val="21"/>
         </w:rPr>
-        <w:t>Three Mermaid erDiagram blocks — Bronze (no FKs), Silver (full FK cardinality), Gold (star schema + AI table cross-domain links)</w:t>
+        <w:t>Three Mermaid erDiagram blocks — Bronze (no FKs), Silver (full FK cardinality with ||--o{ notation), Gold (star schema links)</w:t>
       </w:r>
     </w:p>
     <w:p>
@@ -1153,7 +1153,7 @@
           <w:color w:val="222222"/>
           <w:sz w:val="21"/>
         </w:rPr>
-        <w:t>Complete FK relationship matrix — every FK: source table, column, target, cardinality, and note</w:t>
+        <w:t>Complete FK relationship matrix — every FK with source table, column, target, cardinality, and note</w:t>
       </w:r>
     </w:p>
     <w:p>
@@ -1195,7 +1195,7 @@
           <w:color w:val="222222"/>
           <w:sz w:val="21"/>
         </w:rPr>
-        <w:t>Data lineage map: every Gold table traced back to Silver → Bronze → source system</w:t>
+        <w:t>Data lineage map — every Gold table traced to Silver → Bronze → source system</w:t>
       </w:r>
     </w:p>
     <w:p>
@@ -1209,21 +1209,7 @@
           <w:color w:val="222222"/>
           <w:sz w:val="21"/>
         </w:rPr>
-        <w:t>Distribution &amp; partitioning reference for all 26 tables (REPLICATE vs HASH rationale)</w:t>
-      </w:r>
-    </w:p>
-    <w:p>
-      <w:pPr>
-        <w:pStyle w:val="ListBullet"/>
-        <w:spacing w:before="20" w:after="20"/>
-        <w:ind w:left="792"/>
-      </w:pPr>
-      <w:r>
-        <w:rPr>
-          <w:color w:val="222222"/>
-          <w:sz w:val="21"/>
-        </w:rPr>
-        <w:t>Naming convention glossary: brz_/slv_/gld_, _sk, _at, ai_, is_, _ms suffixes</w:t>
+        <w:t>Distribution &amp; partitioning reference for all 26 tables with REPLICATE vs HASH rationale</w:t>
       </w:r>
     </w:p>
     <w:p>
@@ -1295,7 +1281,7 @@
           <w:color w:val="000000"/>
           <w:sz w:val="22"/>
         </w:rPr>
-        <w:t>"Please create a PPT from the uploaded HCLTech template with respect to our project. Same background colors, don't change them."</w:t>
+        <w:t>"Please create a PPT from the uploaded HCLTech template. Same background colors, don't change them."</w:t>
       </w:r>
     </w:p>
     <w:p>
@@ -1337,7 +1323,7 @@
           <w:color w:val="222222"/>
           <w:sz w:val="21"/>
         </w:rPr>
-        <w:t>Slide 1 — Cover: dark navy HCLTech background, project title, author name, date</w:t>
+        <w:t>Slide 1 — Cover: dark navy HCLTech background, project title, author, date</w:t>
       </w:r>
     </w:p>
     <w:p>
@@ -1393,7 +1379,7 @@
           <w:color w:val="222222"/>
           <w:sz w:val="21"/>
         </w:rPr>
-        <w:t>Generated using python-pptx, saved as docs/AI_Log_Analytics_Platform_HCLTech.pptx</w:t>
+        <w:t>Generated using python-pptx — saved as docs/AI_Log_Analytics_Platform_HCLTech.pptx</w:t>
       </w:r>
     </w:p>
     <w:p>
@@ -1465,7 +1451,7 @@
           <w:color w:val="000000"/>
           <w:sz w:val="22"/>
         </w:rPr>
-        <w:t>"Create an AI journal for this project like prompt in one line for each kind of task and outcome for all steps."</w:t>
+        <w:t>"Create an AI journal for this project — one line prompt per task and outcome for each step."</w:t>
       </w:r>
     </w:p>
     <w:p>
@@ -1507,21 +1493,7 @@
           <w:color w:val="222222"/>
           <w:sz w:val="21"/>
         </w:rPr>
-        <w:t>Summary table with deliverable, file name, and line count per step</w:t>
-      </w:r>
-    </w:p>
-    <w:p>
-      <w:pPr>
-        <w:pStyle w:val="ListBullet"/>
-        <w:spacing w:before="20" w:after="20"/>
-        <w:ind w:left="792"/>
-      </w:pPr>
-      <w:r>
-        <w:rPr>
-          <w:color w:val="222222"/>
-          <w:sz w:val="21"/>
-        </w:rPr>
-        <w:t>Covers full project lifecycle from architecture to presentation</w:t>
+        <w:t>Summary table with step, deliverable, file name, and line count</w:t>
       </w:r>
     </w:p>
     <w:p>
@@ -1635,7 +1607,7 @@
           <w:color w:val="222222"/>
           <w:sz w:val="21"/>
         </w:rPr>
-        <w:t>Each ticket includes: Type, Priority, Story Points, Sprint, Created/Resolved timestamps, Time Spent</w:t>
+        <w:t>Each ticket: Type, Priority, Story Points, Sprint, Created/Resolved timestamps, Time Spent</w:t>
       </w:r>
     </w:p>
     <w:p>
@@ -1663,21 +1635,7 @@
           <w:color w:val="222222"/>
           <w:sz w:val="21"/>
         </w:rPr>
-        <w:t>Acceptance criteria checklist per ticket — matched to actual work validated</w:t>
-      </w:r>
-    </w:p>
-    <w:p>
-      <w:pPr>
-        <w:pStyle w:val="ListBullet"/>
-        <w:spacing w:before="20" w:after="20"/>
-        <w:ind w:left="792"/>
-      </w:pPr>
-      <w:r>
-        <w:rPr>
-          <w:color w:val="222222"/>
-          <w:sz w:val="21"/>
-        </w:rPr>
-        <w:t>Outcomes reference actual file names and line counts — no hallucination</w:t>
+        <w:t>Acceptance criteria checklist per ticket matched to actual work delivered</w:t>
       </w:r>
     </w:p>
     <w:p>

</xml_diff>